<commit_message>
Scaffold Next.js web app (Maurice+) unifying the two HTML prototypes
Next.js 16 + Tailwind app in web/, reusing the teal/coral design tokens
from the prototypes, a real Leaflet/OSM map, and a single deduped
49-business dataset (previously duplicated across the two HTML files).
Data layer (lib/data.ts) reads local JSON for now, structured to swap
to Supabase once a project exists.
</commit_message>
<xml_diff>
--- a/APPLI MODELE ECO.docx
+++ b/APPLI MODELE ECO.docx
@@ -3729,6 +3729,41 @@
           <w:numId w:val="16"/>
         </w:numPr>
       </w:pPr>
+      <w:r>
+        <w:t>Evénements</w:t>
+      </w:r>
+    </w:p>
+    <w:p>
+      <w:pPr>
+        <w:pStyle w:val="Paragraphedeliste"/>
+        <w:numPr>
+          <w:ilvl w:val="1"/>
+          <w:numId w:val="16"/>
+        </w:numPr>
+      </w:pPr>
+      <w:r>
+        <w:t>Seconde main</w:t>
+      </w:r>
+    </w:p>
+    <w:p>
+      <w:pPr>
+        <w:pStyle w:val="Paragraphedeliste"/>
+        <w:numPr>
+          <w:ilvl w:val="1"/>
+          <w:numId w:val="16"/>
+        </w:numPr>
+      </w:pPr>
+      <w:r>
+        <w:t xml:space="preserve">Food, bars (et bars </w:t>
+      </w:r>
+      <w:proofErr w:type="spellStart"/>
+      <w:r>
+        <w:t>hotels</w:t>
+      </w:r>
+      <w:proofErr w:type="spellEnd"/>
+      <w:r>
+        <w:t>)</w:t>
+      </w:r>
     </w:p>
     <w:p/>
     <w:sectPr>

</xml_diff>

<commit_message>
Ajoute le filtrage par thème de cuisine pour les restaurants
Permet de filtrer les 55 fiches restaurants par sous-catégorie (mauricienne,
fruits de mer, indienne, etc.) via une nouvelle ligne de chips multi-select,
avec un export CSV pour classer manuellement les fiches (aucune donnée de
cuisine disponible côté Google Places pour l'instant).

Co-Authored-By: Claude Sonnet 5 <noreply@anthropic.com>
</commit_message>
<xml_diff>
--- a/APPLI MODELE ECO.docx
+++ b/APPLI MODELE ECO.docx
@@ -107,8 +107,14 @@
           <w:ilvl w:val="0"/>
           <w:numId w:val="2"/>
         </w:numPr>
-      </w:pPr>
-      <w:r>
+        <w:rPr>
+          <w:highlight w:val="yellow"/>
+        </w:rPr>
+      </w:pPr>
+      <w:r>
+        <w:rPr>
+          <w:highlight w:val="yellow"/>
+        </w:rPr>
         <w:t xml:space="preserve">Apparition en tête des résultats </w:t>
       </w:r>
     </w:p>
@@ -140,8 +146,14 @@
           <w:ilvl w:val="0"/>
           <w:numId w:val="2"/>
         </w:numPr>
-      </w:pPr>
-      <w:r>
+        <w:rPr>
+          <w:highlight w:val="yellow"/>
+        </w:rPr>
+      </w:pPr>
+      <w:r>
+        <w:rPr>
+          <w:highlight w:val="yellow"/>
+        </w:rPr>
         <w:t xml:space="preserve">Statistiques de consultation </w:t>
       </w:r>
     </w:p>
@@ -151,8 +163,14 @@
           <w:ilvl w:val="0"/>
           <w:numId w:val="2"/>
         </w:numPr>
-      </w:pPr>
-      <w:r>
+        <w:rPr>
+          <w:highlight w:val="yellow"/>
+        </w:rPr>
+      </w:pPr>
+      <w:r>
+        <w:rPr>
+          <w:highlight w:val="yellow"/>
+        </w:rPr>
         <w:t xml:space="preserve">Bouton WhatsApp </w:t>
       </w:r>
     </w:p>
@@ -3686,6 +3704,11 @@
       </w:r>
     </w:p>
     <w:p>
+      <w:r>
+        <w:t>SPORT</w:t>
+      </w:r>
+    </w:p>
+    <w:p>
       <w:pPr>
         <w:pStyle w:val="Paragraphedeliste"/>
         <w:numPr>
@@ -3718,7 +3741,15 @@
         </w:numPr>
       </w:pPr>
       <w:r>
-        <w:t>Transports (taxis, bus</w:t>
+        <w:t>Complexes sportifs (</w:t>
+      </w:r>
+      <w:proofErr w:type="spellStart"/>
+      <w:r>
+        <w:t>multi-sports</w:t>
+      </w:r>
+      <w:proofErr w:type="spellEnd"/>
+      <w:r>
+        <w:t>),</w:t>
       </w:r>
     </w:p>
     <w:p>
@@ -3730,7 +3761,7 @@
         </w:numPr>
       </w:pPr>
       <w:r>
-        <w:t>Evénements</w:t>
+        <w:t>Sports plage</w:t>
       </w:r>
     </w:p>
     <w:p>
@@ -3742,7 +3773,12 @@
         </w:numPr>
       </w:pPr>
       <w:r>
-        <w:t>Seconde main</w:t>
+        <w:t>Sports nature</w:t>
+      </w:r>
+    </w:p>
+    <w:p>
+      <w:r>
+        <w:t>VIE QUOTIDIENNE</w:t>
       </w:r>
     </w:p>
     <w:p>
@@ -3754,6 +3790,47 @@
         </w:numPr>
       </w:pPr>
       <w:r>
+        <w:t>Transports (taxis, bus</w:t>
+      </w:r>
+    </w:p>
+    <w:p>
+      <w:pPr>
+        <w:pStyle w:val="Paragraphedeliste"/>
+        <w:numPr>
+          <w:ilvl w:val="1"/>
+          <w:numId w:val="16"/>
+        </w:numPr>
+      </w:pPr>
+      <w:r>
+        <w:t>Evénements</w:t>
+      </w:r>
+    </w:p>
+    <w:p>
+      <w:pPr>
+        <w:pStyle w:val="Paragraphedeliste"/>
+        <w:numPr>
+          <w:ilvl w:val="1"/>
+          <w:numId w:val="16"/>
+        </w:numPr>
+      </w:pPr>
+      <w:r>
+        <w:t>Seconde main</w:t>
+      </w:r>
+    </w:p>
+    <w:p>
+      <w:r>
+        <w:t>FOOD</w:t>
+      </w:r>
+    </w:p>
+    <w:p>
+      <w:pPr>
+        <w:pStyle w:val="Paragraphedeliste"/>
+        <w:numPr>
+          <w:ilvl w:val="1"/>
+          <w:numId w:val="16"/>
+        </w:numPr>
+      </w:pPr>
+      <w:r>
         <w:t xml:space="preserve">Food, bars (et bars </w:t>
       </w:r>
       <w:proofErr w:type="spellStart"/>
@@ -3763,6 +3840,126 @@
       <w:proofErr w:type="spellEnd"/>
       <w:r>
         <w:t>)</w:t>
+      </w:r>
+    </w:p>
+    <w:p/>
+    <w:p>
+      <w:r>
+        <w:t xml:space="preserve">Sous-catégories à développer ou permettre </w:t>
+      </w:r>
+      <w:proofErr w:type="gramStart"/>
+      <w:r>
+        <w:t>des filtres sur</w:t>
+      </w:r>
+      <w:proofErr w:type="gramEnd"/>
+      <w:r>
+        <w:t> :</w:t>
+      </w:r>
+    </w:p>
+    <w:p>
+      <w:pPr>
+        <w:pStyle w:val="Paragraphedeliste"/>
+        <w:numPr>
+          <w:ilvl w:val="1"/>
+          <w:numId w:val="16"/>
+        </w:numPr>
+      </w:pPr>
+      <w:r>
+        <w:t>La carte,</w:t>
+      </w:r>
+    </w:p>
+    <w:p>
+      <w:pPr>
+        <w:pStyle w:val="Paragraphedeliste"/>
+        <w:numPr>
+          <w:ilvl w:val="1"/>
+          <w:numId w:val="16"/>
+        </w:numPr>
+      </w:pPr>
+      <w:r>
+        <w:t>Les prix,</w:t>
+      </w:r>
+    </w:p>
+    <w:p>
+      <w:pPr>
+        <w:pStyle w:val="Paragraphedeliste"/>
+        <w:numPr>
+          <w:ilvl w:val="1"/>
+          <w:numId w:val="16"/>
+        </w:numPr>
+      </w:pPr>
+      <w:r>
+        <w:t xml:space="preserve">Les </w:t>
+      </w:r>
+      <w:proofErr w:type="spellStart"/>
+      <w:r>
+        <w:t>sous-natures</w:t>
+      </w:r>
+      <w:proofErr w:type="spellEnd"/>
+      <w:r>
+        <w:t xml:space="preserve"> d’activité</w:t>
+      </w:r>
+    </w:p>
+    <w:p>
+      <w:r>
+        <w:t xml:space="preserve">Kids </w:t>
+      </w:r>
+      <w:proofErr w:type="spellStart"/>
+      <w:r>
+        <w:t>friendly</w:t>
+      </w:r>
+      <w:proofErr w:type="spellEnd"/>
+    </w:p>
+    <w:p/>
+    <w:p>
+      <w:pPr>
+        <w:pStyle w:val="Paragraphedeliste"/>
+        <w:numPr>
+          <w:ilvl w:val="1"/>
+          <w:numId w:val="16"/>
+        </w:numPr>
+      </w:pPr>
+      <w:r>
+        <w:t>Jardi</w:t>
+      </w:r>
+    </w:p>
+    <w:p>
+      <w:pPr>
+        <w:pStyle w:val="Paragraphedeliste"/>
+        <w:numPr>
+          <w:ilvl w:val="1"/>
+          <w:numId w:val="16"/>
+        </w:numPr>
+      </w:pPr>
+      <w:proofErr w:type="gramStart"/>
+      <w:r>
+        <w:t>n</w:t>
+      </w:r>
+      <w:proofErr w:type="gramEnd"/>
+      <w:r>
+        <w:t xml:space="preserve"> et balades forêts</w:t>
+      </w:r>
+    </w:p>
+    <w:p>
+      <w:pPr>
+        <w:pStyle w:val="Paragraphedeliste"/>
+        <w:numPr>
+          <w:ilvl w:val="1"/>
+          <w:numId w:val="16"/>
+        </w:numPr>
+      </w:pPr>
+      <w:r>
+        <w:t>Parc animaliers</w:t>
+      </w:r>
+    </w:p>
+    <w:p>
+      <w:r>
+        <w:t xml:space="preserve">ACTIVITES </w:t>
+      </w:r>
+    </w:p>
+    <w:p>
+      <w:r>
+        <w:t>Culture</w:t>
       </w:r>
     </w:p>
     <w:p/>

</xml_diff>